<commit_message>
feat(idsup): petition for writ gates latex too: with the model's heading keep, LaTeX carries the split heading to p16 as typst and Word do; XENG-001..003 pass on latex and docx, tier 1 0 failed (fb-595.54.47)
Co-Authored-By: Claude Opus 5.5 <noreply@anthropic.com>
</commit_message>
<xml_diff>
--- a/courts/ninth-circuit/idaho/state/supreme-court/petition-for-writ/usage/OUTPUT-petition-for-writ.docx
+++ b/courts/ninth-circuit/idaho/state/supreme-court/petition-for-writ/usage/OUTPUT-petition-for-writ.docx
@@ -1028,19 +1028,7 @@
         <w:pStyle w:val="BodyText"/>
       </w:pPr>
       <w:r>
-        <w:t xml:space="preserve">Reclaim Idaho and the Committee to Protect and Preserve the Idaho Constitution bring this original action seeking a declaration that provisions of Idaho Code § 34</w:t>
-      </w:r>
-      <w:r>
-        <w:noBreakHyphen/>
-      </w:r>
-      <w:r>
-        <w:t xml:space="preserve">1805(2) and Idaho Code § 34</w:t>
-      </w:r>
-      <w:r>
-        <w:noBreakHyphen/>
-      </w:r>
-      <w:r>
-        <w:t xml:space="preserve">1813(2)⁠(a), pertaining to initiatives and referendums, violate Article III, § 1 of the Idaho Constitution. They further seek a peremptory writ of prohibition from this Court prohibiting the Secretary of State or any other state official from enforcing these unconstitutional provisions.</w:t>
+        <w:t xml:space="preserve">Reclaim Idaho and the Committee to Protect and Preserve the Idaho Constitution bring this original action seeking a declaration that provisions of Idaho Code § 34-⁠1805(2) and Idaho Code § 34-⁠1813(2)⁠(a), pertaining to initiatives and referendums, violate Article III, § 1 of the Idaho Constitution. They further seek a peremptory writ of prohibition from this Court prohibiting the Secretary of State or any other state official from enforcing these unconstitutional provisions.</w:t>
       </w:r>
     </w:p>
     <w:p>
@@ -1064,13 +1052,7 @@
         <w:pStyle w:val="BodyText"/>
       </w:pPr>
       <w:r>
-        <w:t xml:space="preserve">1. The Court has “original jurisdiction to issue writs of mandamus, certiorari, prohibition, and habeas corpus, and all writs necessary or proper to the complete exercise of its appellate jurisdiction.” Idaho Const., art. V, § 9; Idaho Code § 1203; Idaho Code § 7</w:t>
-      </w:r>
-      <w:r>
-        <w:noBreakHyphen/>
-      </w:r>
-      <w:r>
-        <w:t xml:space="preserve">402.</w:t>
+        <w:t xml:space="preserve">1. The Court has “original jurisdiction to issue writs of mandamus, certiorari, prohibition, and habeas corpus, and all writs necessary or proper to the complete exercise of its appellate jurisdiction.” Idaho Const., art. V, § 9; Idaho Code § 1203; Idaho Code § 7-⁠402.</w:t>
       </w:r>
     </w:p>
     <w:p>
@@ -1118,47 +1100,23 @@
         <w:pStyle w:val="BodyText"/>
       </w:pPr>
       <w:r>
-        <w:t xml:space="preserve">5. Petitioner Reclaim Idaho is an Idaho based political action committee, registered with the Idaho Secretary of State. Reclaim Idaho is a grassroots organization designed to protect and improve the lives of working Idahoans. It advocates for candidates and initiatives that strengthen public schools, protect public lands, and extend healthcare to working families. Reclaim Idaho alleges a distinct and palpable injury that is fairly traceable to the new requirements in Idaho Code § 34</w:t>
-      </w:r>
-      <w:r>
-        <w:noBreakHyphen/>
-      </w:r>
-      <w:r>
-        <w:t xml:space="preserve">1805(2) and § 34</w:t>
-      </w:r>
-      <w:r>
-        <w:noBreakHyphen/>
-      </w:r>
-      <w:r>
-        <w:t xml:space="preserve">1813(2). It successfully qualified an initiative for the ballot in 2018 and is actively pursuing two initiatives for the 2022 election cycle. These new provisions unreasonably burden its ability to exercise its constitutional right under Article III, § 1. Reclaim Idaho is also pursuing this case on behalf of the people statewide to protect their fundamental constitutional right to the initiative and the referendum.</w:t>
-      </w:r>
-    </w:p>
-    <w:p>
-      <w:pPr>
-        <w:pStyle w:val="BodyText"/>
-      </w:pPr>
-      <w:r>
-        <w:t xml:space="preserve">6. Petitioner Committee to Protect and Preserve the Idaho Constitution, Inc., is an Idaho non-profit corporation registered with the Idaho Secretary of State. The Committee’s President is a former attorney general of Idaho, and its membership includes a former Secretary of State, and other distinguished Idaho jurists and lawyers, who have formed to protect the Idaho Constitution from the legislature’s attempts to weaken it. The Committee alleges a distinct and palpable injury that is fairly traceable to the requirements of Idaho Code § 34</w:t>
-      </w:r>
-      <w:r>
-        <w:noBreakHyphen/>
-      </w:r>
-      <w:r>
-        <w:t xml:space="preserve">1805(2). It is actively pursuing a referendum for the 2022 election cycle. The new statutory requirements unreasonably burden its ability to exercise its constitutional right under Article III, § 1. The Committee is also pursuing this case on behalf of the people statewide to protect their fundamental constitutional right to the initiative and the referendum.</w:t>
-      </w:r>
-    </w:p>
-    <w:p>
-      <w:pPr>
-        <w:pStyle w:val="BodyText"/>
-      </w:pPr>
-      <w:r>
-        <w:t xml:space="preserve">7. Respondent Lawerence Denney is named is his official capacity as the duly elected Secretary of State of Idaho. Secretary Denney is the Chief Elections Officer in the state as set forth in Idaho Code § 34</w:t>
-      </w:r>
-      <w:r>
-        <w:noBreakHyphen/>
-      </w:r>
-      <w:r>
-        <w:t xml:space="preserve">201. It is his responsibility to obtain and maintain uniformity in the application, operation, and interpretation of the election laws.</w:t>
+        <w:t xml:space="preserve">5. Petitioner Reclaim Idaho is an Idaho based political action committee, registered with the Idaho Secretary of State. Reclaim Idaho is a grassroots organization designed to protect and improve the lives of working Idahoans. It advocates for candidates and initiatives that strengthen public schools, protect public lands, and extend healthcare to working families. Reclaim Idaho alleges a distinct and palpable injury that is fairly traceable to the new requirements in Idaho Code § 34-⁠1805(2) and § 34-⁠1813(2). It successfully qualified an initiative for the ballot in 2018 and is actively pursuing two initiatives for the 2022 election cycle. These new provisions unreasonably burden its ability to exercise its constitutional right under Article III, § 1. Reclaim Idaho is also pursuing this case on behalf of the people statewide to protect their fundamental constitutional right to the initiative and the referendum.</w:t>
+      </w:r>
+    </w:p>
+    <w:p>
+      <w:pPr>
+        <w:pStyle w:val="BodyText"/>
+      </w:pPr>
+      <w:r>
+        <w:t xml:space="preserve">6. Petitioner Committee to Protect and Preserve the Idaho Constitution, Inc., is an Idaho non-profit corporation registered with the Idaho Secretary of State. The Committee’s President is a former attorney general of Idaho, and its membership includes a former Secretary of State, and other distinguished Idaho jurists and lawyers, who have formed to protect the Idaho Constitution from the legislature’s attempts to weaken it. The Committee alleges a distinct and palpable injury that is fairly traceable to the requirements of Idaho Code § 34-⁠1805(2). It is actively pursuing a referendum for the 2022 election cycle. The new statutory requirements unreasonably burden its ability to exercise its constitutional right under Article III, § 1. The Committee is also pursuing this case on behalf of the people statewide to protect their fundamental constitutional right to the initiative and the referendum.</w:t>
+      </w:r>
+    </w:p>
+    <w:p>
+      <w:pPr>
+        <w:pStyle w:val="BodyText"/>
+      </w:pPr>
+      <w:r>
+        <w:t xml:space="preserve">7. Respondent Lawerence Denney is named is his official capacity as the duly elected Secretary of State of Idaho. Secretary Denney is the Chief Elections Officer in the state as set forth in Idaho Code § 34-⁠201. It is his responsibility to obtain and maintain uniformity in the application, operation, and interpretation of the election laws.</w:t>
       </w:r>
       <w:r>
         <w:t xml:space="preserve"> </w:t>
@@ -1174,25 +1132,7 @@
         <w:t xml:space="preserve"> </w:t>
       </w:r>
       <w:r>
-        <w:t xml:space="preserve">Initiative or referendum petitions must be filed with the Secretary of State for his compliance review after county clerks have reviewed and verified signatures. Idaho Code §§ 34</w:t>
-      </w:r>
-      <w:r>
-        <w:noBreakHyphen/>
-      </w:r>
-      <w:r>
-        <w:t xml:space="preserve">1802, 1803. Pursuant to Idaho Code § 34</w:t>
-      </w:r>
-      <w:r>
-        <w:noBreakHyphen/>
-      </w:r>
-      <w:r>
-        <w:t xml:space="preserve">1807 county clerks prepare certificates for the Secretary of State indicating the number of signatures from each legislative district they have verified. Before placing them on the ballot, the Secretary of State has a duty to ensure that signatures supporting the petitions comply with the percentage and geographical distribution requirements set by Idaho Code in § 34</w:t>
-      </w:r>
-      <w:r>
-        <w:noBreakHyphen/>
-      </w:r>
-      <w:r>
-        <w:t xml:space="preserve">1805(2), now set at 6% of registered voters in each of Idaho’s 35 legislative districts.</w:t>
+        <w:t xml:space="preserve">Initiative or referendum petitions must be filed with the Secretary of State for his compliance review after county clerks have reviewed and verified signatures. Idaho Code §§ 34-⁠1802, 1803. Pursuant to Idaho Code § 34-⁠1807 county clerks prepare certificates for the Secretary of State indicating the number of signatures from each legislative district they have verified. Before placing them on the ballot, the Secretary of State has a duty to ensure that signatures supporting the petitions comply with the percentage and geographical distribution requirements set by Idaho Code in § 34-⁠1805(2), now set at 6% of registered voters in each of Idaho’s 35 legislative districts.</w:t>
       </w:r>
     </w:p>
     <w:p>
@@ -1872,27 +1812,15 @@
         <w:t xml:space="preserve">See, e.g.</w:t>
       </w:r>
       <w:r>
-        <w:t xml:space="preserve">, Exhibit 6, Declaration of Karen Lansing, ¶ 6; Exhibit 7, Declaration of Linda Larson, ¶¶ 4</w:t>
-      </w:r>
-      <w:r>
-        <w:noBreakHyphen/>
-      </w:r>
-      <w:r>
-        <w:t xml:space="preserve">5; Exhibit 8, Declaration of Jessica Mahuron, ¶ 4.</w:t>
-      </w:r>
-    </w:p>
-    <w:p>
-      <w:pPr>
-        <w:pStyle w:val="BodyText"/>
-      </w:pPr>
-      <w:r>
-        <w:t xml:space="preserve">27. Still, it was exceedingly difficult to comply with the requirement to get valid signatures from 6% of the registered voters in 18 legislative districts. Mayville Decl., ¶¶ 22, 39; Mahuron Decl., ¶¶ 4</w:t>
-      </w:r>
-      <w:r>
-        <w:noBreakHyphen/>
-      </w:r>
-      <w:r>
-        <w:t xml:space="preserve">5.</w:t>
+        <w:t xml:space="preserve">, Exhibit 6, Declaration of Karen Lansing, ¶ 6; Exhibit 7, Declaration of Linda Larson, ¶¶ 4-⁠5; Exhibit 8, Declaration of Jessica Mahuron, ¶ 4.</w:t>
+      </w:r>
+    </w:p>
+    <w:p>
+      <w:pPr>
+        <w:pStyle w:val="BodyText"/>
+      </w:pPr>
+      <w:r>
+        <w:t xml:space="preserve">27. Still, it was exceedingly difficult to comply with the requirement to get valid signatures from 6% of the registered voters in 18 legislative districts. Mayville Decl., ¶¶ 22, 39; Mahuron Decl., ¶¶ 4-⁠5.</w:t>
       </w:r>
     </w:p>
     <w:p>
@@ -1940,13 +1868,7 @@
         <w:t xml:space="preserve"> </w:t>
       </w:r>
       <w:r>
-        <w:t xml:space="preserve">at ¶¶ 25</w:t>
-      </w:r>
-      <w:r>
-        <w:noBreakHyphen/>
-      </w:r>
-      <w:r>
-        <w:t xml:space="preserve">26. The districts with the lowest organizational potential were those in which contacts were limited.</w:t>
+        <w:t xml:space="preserve">at ¶¶ 25-⁠26. The districts with the lowest organizational potential were those in which contacts were limited.</w:t>
       </w:r>
       <w:r>
         <w:t xml:space="preserve"> </w:t>
@@ -1970,13 +1892,7 @@
         <w:pStyle w:val="BodyText"/>
       </w:pPr>
       <w:r>
-        <w:t xml:space="preserve">30. Reclaim Idaho had success in the districts that had high organizational potential. Mayville Decl., ¶¶ 26</w:t>
-      </w:r>
-      <w:r>
-        <w:noBreakHyphen/>
-      </w:r>
-      <w:r>
-        <w:t xml:space="preserve">28. Middle tier districts were harder.</w:t>
+        <w:t xml:space="preserve">30. Reclaim Idaho had success in the districts that had high organizational potential. Mayville Decl., ¶¶ 26-⁠28. Middle tier districts were harder.</w:t>
       </w:r>
       <w:r>
         <w:t xml:space="preserve"> </w:t>
@@ -2016,13 +1932,7 @@
         <w:pStyle w:val="BodyText"/>
       </w:pPr>
       <w:r>
-        <w:t xml:space="preserve">31. Successfully qualifying an initiative or a referendum, then, is not necessarily a reflection of voter support in a district. It is instead a function of the organizational potential and organizational strength of the proponents in each district so that the support that otherwise may be latent there can be captured. Mayville Decl., ¶¶ 17</w:t>
-      </w:r>
-      <w:r>
-        <w:noBreakHyphen/>
-      </w:r>
-      <w:r>
-        <w:t xml:space="preserve">44.</w:t>
+        <w:t xml:space="preserve">31. Successfully qualifying an initiative or a referendum, then, is not necessarily a reflection of voter support in a district. It is instead a function of the organizational potential and organizational strength of the proponents in each district so that the support that otherwise may be latent there can be captured. Mayville Decl., ¶¶ 17-⁠44.</w:t>
       </w:r>
     </w:p>
     <w:p>
@@ -2046,13 +1956,7 @@
         <w:pStyle w:val="BodyText"/>
       </w:pPr>
       <w:r>
-        <w:t xml:space="preserve">34. In 2020, the legislature quietly amended Idaho Code § 34</w:t>
-      </w:r>
-      <w:r>
-        <w:noBreakHyphen/>
-      </w:r>
-      <w:r>
-        <w:t xml:space="preserve">1813(2)⁠(a). That provision now prohibits any citizens’ initiative from taking effect sooner than July 1 of the year following the general election. This gives the legislature an opportunity to repeal any initiated statute before the law has taken effect.</w:t>
+        <w:t xml:space="preserve">34. In 2020, the legislature quietly amended Idaho Code § 34-⁠1813(2)⁠(a). That provision now prohibits any citizens’ initiative from taking effect sooner than July 1 of the year following the general election. This gives the legislature an opportunity to repeal any initiated statute before the law has taken effect.</w:t>
       </w:r>
     </w:p>
     <w:p>
@@ -2076,13 +1980,7 @@
         <w:pStyle w:val="BodyText"/>
       </w:pPr>
       <w:r>
-        <w:t xml:space="preserve">37. Governor Little signed Senate Bill 1110 into law, amending Idaho Code § 18</w:t>
-      </w:r>
-      <w:r>
-        <w:noBreakHyphen/>
-      </w:r>
-      <w:r>
-        <w:t xml:space="preserve">1805(2). In his signing statement, he invited the “Idaho judiciary” to address its constitutionality. See April 17, 2021 Letter from Bradley Little to Honorable Janice McGeachin, at https://​tinyurl.​com/​ymkcbz6y.</w:t>
+        <w:t xml:space="preserve">37. Governor Little signed Senate Bill 1110 into law, amending Idaho Code § 18-⁠1805(2). In his signing statement, he invited the “Idaho judiciary” to address its constitutionality. See April 17, 2021 Letter from Bradley Little to Honorable Janice McGeachin, at https://​tinyurl.​com/​ymkcbz6y.</w:t>
       </w:r>
     </w:p>
     <w:p>
@@ -2212,13 +2110,7 @@
         <w:pStyle w:val="BodyText"/>
       </w:pPr>
       <w:r>
-        <w:t xml:space="preserve">39. Reclaim Idaho has begun two initiative drives for the 2022 election cycle. It filed one on April 7, 2021, called the “Initiative Rights Act,” in which it seeks to put to the voters whether to eliminate the geographical distribution requirement in Idaho Code § 18</w:t>
-      </w:r>
-      <w:r>
-        <w:noBreakHyphen/>
-      </w:r>
-      <w:r>
-        <w:t xml:space="preserve">1805(2). Mayville Decl., ¶ 6. It filed the second initiative on April 28, 2021, called the “Quality Education Act,” in which it seeks to place on the ballot an initiative that would increase funding for K</w:t>
+        <w:t xml:space="preserve">39. Reclaim Idaho has begun two initiative drives for the 2022 election cycle. It filed one on April 7, 2021, called the “Initiative Rights Act,” in which it seeks to put to the voters whether to eliminate the geographical distribution requirement in Idaho Code § 18-⁠1805(2). Mayville Decl., ¶ 6. It filed the second initiative on April 28, 2021, called the “Quality Education Act,” in which it seeks to place on the ballot an initiative that would increase funding for K</w:t>
       </w:r>
       <w:r>
         <w:noBreakHyphen/>
@@ -2320,19 +2212,7 @@
         <w:t xml:space="preserve"> </w:t>
       </w:r>
       <w:r>
-        <w:t xml:space="preserve">Idaho Code § 34</w:t>
-      </w:r>
-      <w:r>
-        <w:noBreakHyphen/>
-      </w:r>
-      <w:r>
-        <w:t xml:space="preserve">1802(1) and § 34</w:t>
-      </w:r>
-      <w:r>
-        <w:noBreakHyphen/>
-      </w:r>
-      <w:r>
-        <w:t xml:space="preserve">1803.</w:t>
+        <w:t xml:space="preserve">Idaho Code § 34-⁠1802(1) and § 34-⁠1803.</w:t>
       </w:r>
     </w:p>
     <w:p>
@@ -2388,25 +2268,7 @@
         <w:pStyle w:val="BodyText"/>
       </w:pPr>
       <w:r>
-        <w:t xml:space="preserve">54. The legislature has also made it easier to remove signatures by empowering voters who have signed a petition to remove their signatures through a simple email to the county clerk. Idaho Code § 34</w:t>
-      </w:r>
-      <w:r>
-        <w:noBreakHyphen/>
-      </w:r>
-      <w:r>
-        <w:t xml:space="preserve">1803B(2); Daley Decl., ¶ 16. Electronic signature gathering, however, is explicitly prohibited. Idaho Code § 34</w:t>
-      </w:r>
-      <w:r>
-        <w:noBreakHyphen/>
-      </w:r>
-      <w:r>
-        <w:t xml:space="preserve">1807(5). All signatories in support of a petition must physically sign a petition in the presence of a collector and their signatures must be verified by a county clerk. Idaho Code § 34</w:t>
-      </w:r>
-      <w:r>
-        <w:noBreakHyphen/>
-      </w:r>
-      <w:r>
-        <w:t xml:space="preserve">1807.</w:t>
+        <w:t xml:space="preserve">54. The legislature has also made it easier to remove signatures by empowering voters who have signed a petition to remove their signatures through a simple email to the county clerk. Idaho Code § 34-⁠1803B(2); Daley Decl., ¶ 16. Electronic signature gathering, however, is explicitly prohibited. Idaho Code § 34-⁠1807(5). All signatories in support of a petition must physically sign a petition in the presence of a collector and their signatures must be verified by a county clerk. Idaho Code § 34-⁠1807.</w:t>
       </w:r>
     </w:p>
     <w:p>
@@ -2588,9 +2450,7 @@
           <w:b/>
           <w:bCs/>
         </w:rPr>
-        <w:t xml:space="preserve">34</w:t>
-        <w:noBreakHyphen/>
-        <w:t xml:space="preserve">1805(2)</w:t>
+        <w:t xml:space="preserve">34-⁠1805(2)</w:t>
       </w:r>
       <w:r>
         <w:rPr>
@@ -3146,13 +3006,7 @@
         <w:pStyle w:val="BodyText"/>
       </w:pPr>
       <w:r>
-        <w:t xml:space="preserve">60. By passing Senate Bill 1110, now codified as Idaho Code § 34</w:t>
-      </w:r>
-      <w:r>
-        <w:noBreakHyphen/>
-      </w:r>
-      <w:r>
-        <w:t xml:space="preserve">1805(2), the legislature has effectively taken away the people’s right to make or repeal law.</w:t>
+        <w:t xml:space="preserve">60. By passing Senate Bill 1110, now codified as Idaho Code § 34-⁠1805(2), the legislature has effectively taken away the people’s right to make or repeal law.</w:t>
       </w:r>
     </w:p>
     <w:p>
@@ -3200,27 +3054,15 @@
         <w:pStyle w:val="BodyText"/>
       </w:pPr>
       <w:r>
-        <w:t xml:space="preserve">66. The chapter in the Idaho Code governing initiatives and referendums contains a severability clause: “In the event that any part of chapter 18, title 34, Idaho Code, shall for any reason be determined void or unenforceable in any part thereof, the remainder thereof shall remain in full force and effect.” Idaho Code § 34</w:t>
-      </w:r>
-      <w:r>
-        <w:noBreakHyphen/>
-      </w:r>
-      <w:r>
-        <w:t xml:space="preserve">1823.</w:t>
-      </w:r>
-    </w:p>
-    <w:p>
-      <w:pPr>
-        <w:pStyle w:val="BodyText"/>
-      </w:pPr>
-      <w:r>
-        <w:t xml:space="preserve">67. As a remedy, the Court should declare that the following phrase in Idaho Code § 34</w:t>
-      </w:r>
-      <w:r>
-        <w:noBreakHyphen/>
-      </w:r>
-      <w:r>
-        <w:t xml:space="preserve">1805(2) is unconstitutional and cannot be enforced: “in each of the thirty-five (35) legislative districts.”</w:t>
+        <w:t xml:space="preserve">66. The chapter in the Idaho Code governing initiatives and referendums contains a severability clause: “In the event that any part of chapter 18, title 34, Idaho Code, shall for any reason be determined void or unenforceable in any part thereof, the remainder thereof shall remain in full force and effect.” Idaho Code § 34-⁠1823.</w:t>
+      </w:r>
+    </w:p>
+    <w:p>
+      <w:pPr>
+        <w:pStyle w:val="BodyText"/>
+      </w:pPr>
+      <w:r>
+        <w:t xml:space="preserve">67. As a remedy, the Court should declare that the following phrase in Idaho Code § 34-⁠1805(2) is unconstitutional and cannot be enforced: “in each of the thirty-five (35) legislative districts.”</w:t>
       </w:r>
     </w:p>
     <w:p>
@@ -3348,9 +3190,7 @@
           <w:b/>
           <w:bCs/>
         </w:rPr>
-        <w:t xml:space="preserve">34</w:t>
-        <w:noBreakHyphen/>
-        <w:t xml:space="preserve">1813(2)⁠(a)</w:t>
+        <w:t xml:space="preserve">34-⁠1813(2)⁠(a)</w:t>
       </w:r>
       <w:r>
         <w:rPr>
@@ -3742,13 +3582,7 @@
         <w:pStyle w:val="BodyText"/>
       </w:pPr>
       <w:r>
-        <w:t xml:space="preserve">75. The Court should declare Idaho Code § 34</w:t>
-      </w:r>
-      <w:r>
-        <w:noBreakHyphen/>
-      </w:r>
-      <w:r>
-        <w:t xml:space="preserve">1813(2) unconstitutional and unenforceable.</w:t>
+        <w:t xml:space="preserve">75. The Court should declare Idaho Code § 34-⁠1813(2) unconstitutional and unenforceable.</w:t>
       </w:r>
     </w:p>
     <w:p>
@@ -3808,55 +3642,31 @@
         <w:pStyle w:val="BodyText"/>
       </w:pPr>
       <w:r>
-        <w:t xml:space="preserve">(a) Declare that the requirement of Idaho Code § 34</w:t>
-      </w:r>
-      <w:r>
-        <w:noBreakHyphen/>
-      </w:r>
-      <w:r>
-        <w:t xml:space="preserve">1805(2) that initiative and referendum petitions must be supported by the valid signatures of 6% of the registered voters in each of Idaho’s 35 legislative districts is an unconstitutional restriction on the people’s right under Article III, § 1.</w:t>
-      </w:r>
-    </w:p>
-    <w:p>
-      <w:pPr>
-        <w:pStyle w:val="BodyText"/>
-      </w:pPr>
-      <w:r>
-        <w:t xml:space="preserve">(b) Declare that Idaho Code § 34</w:t>
-      </w:r>
-      <w:r>
-        <w:noBreakHyphen/>
-      </w:r>
-      <w:r>
-        <w:t xml:space="preserve">1805(2) is constitutional and enforceable only to the extent that it reads: “Before such petitions shall be entitled to final filing and consideration by the secretary of state, there shall be affixed thereto the signatures of legal voters equal in number to not less than six percent (6%) of the qualified electors at the time of the last general election.”</w:t>
-      </w:r>
-    </w:p>
-    <w:p>
-      <w:pPr>
-        <w:pStyle w:val="BodyText"/>
-      </w:pPr>
-      <w:r>
-        <w:t xml:space="preserve">(c) Declare that the prohibition in Idaho Code § 34</w:t>
-      </w:r>
-      <w:r>
-        <w:noBreakHyphen/>
-      </w:r>
-      <w:r>
-        <w:t xml:space="preserve">1813(2) on an effective date for legislation passed by initiative before July 1 of the year following its passage is an unconstitutional restriction on the people’s right under Article III, § 1.</w:t>
-      </w:r>
-    </w:p>
-    <w:p>
-      <w:pPr>
-        <w:pStyle w:val="BodyText"/>
-      </w:pPr>
-      <w:r>
-        <w:t xml:space="preserve">(d) Issue a peremptory writ of prohibition to the Idaho Secretary of State permanently and absolutely prohibiting him from enforcing the requirement in Idaho Code § 34</w:t>
-      </w:r>
-      <w:r>
-        <w:noBreakHyphen/>
-      </w:r>
-      <w:r>
-        <w:t xml:space="preserve">1805(2) that initiative and referendum petitions be supported by 6% of the registered voters in each of Idaho’s 35 legislative districts.</w:t>
+        <w:t xml:space="preserve">(a) Declare that the requirement of Idaho Code § 34-⁠1805(2) that initiative and referendum petitions must be supported by the valid signatures of 6% of the registered voters in each of Idaho’s 35 legislative districts is an unconstitutional restriction on the people’s right under Article III, § 1.</w:t>
+      </w:r>
+    </w:p>
+    <w:p>
+      <w:pPr>
+        <w:pStyle w:val="BodyText"/>
+      </w:pPr>
+      <w:r>
+        <w:t xml:space="preserve">(b) Declare that Idaho Code § 34-⁠1805(2) is constitutional and enforceable only to the extent that it reads: “Before such petitions shall be entitled to final filing and consideration by the secretary of state, there shall be affixed thereto the signatures of legal voters equal in number to not less than six percent (6%) of the qualified electors at the time of the last general election.”</w:t>
+      </w:r>
+    </w:p>
+    <w:p>
+      <w:pPr>
+        <w:pStyle w:val="BodyText"/>
+      </w:pPr>
+      <w:r>
+        <w:t xml:space="preserve">(c) Declare that the prohibition in Idaho Code § 34-⁠1813(2) on an effective date for legislation passed by initiative before July 1 of the year following its passage is an unconstitutional restriction on the people’s right under Article III, § 1.</w:t>
+      </w:r>
+    </w:p>
+    <w:p>
+      <w:pPr>
+        <w:pStyle w:val="BodyText"/>
+      </w:pPr>
+      <w:r>
+        <w:t xml:space="preserve">(d) Issue a peremptory writ of prohibition to the Idaho Secretary of State permanently and absolutely prohibiting him from enforcing the requirement in Idaho Code § 34-⁠1805(2) that initiative and referendum petitions be supported by 6% of the registered voters in each of Idaho’s 35 legislative districts.</w:t>
       </w:r>
     </w:p>
     <w:p>
@@ -3872,19 +3682,7 @@
         <w:pStyle w:val="BodyText"/>
       </w:pPr>
       <w:r>
-        <w:t xml:space="preserve">(f) For an award of attorney fees and costs of this action pursuant the private attorney general doctrine, Idaho Code § 12</w:t>
-      </w:r>
-      <w:r>
-        <w:noBreakHyphen/>
-      </w:r>
-      <w:r>
-        <w:t xml:space="preserve">117, § 12</w:t>
-      </w:r>
-      <w:r>
-        <w:noBreakHyphen/>
-      </w:r>
-      <w:r>
-        <w:t xml:space="preserve">121, or as otherwise provided by law.</w:t>
+        <w:t xml:space="preserve">(f) For an award of attorney fees and costs of this action pursuant the private attorney general doctrine, Idaho Code § 12-⁠117, § 12-⁠121, or as otherwise provided by law.</w:t>
       </w:r>
     </w:p>
     <w:p>
@@ -5191,6 +4989,33 @@
       <w:ind w:left="2160" w:hanging="720"/>
     </w:pPr>
   </w:style>
+  <w:style w:type="paragraph" w:customStyle="1" w:styleId="XdQuoteList1">
+    <w:name w:val="Xd Quote List 1"/>
+    <w:basedOn w:val="Normal"/>
+    <w:qFormat/>
+    <w:pPr>
+      <w:spacing w:before="0" w:after="0" w:line="322" w:lineRule="exact"/>
+      <w:ind w:left="1440" w:right="720" w:hanging="720"/>
+    </w:pPr>
+  </w:style>
+  <w:style w:type="paragraph" w:customStyle="1" w:styleId="XdQuoteList2">
+    <w:name w:val="Xd Quote List 2"/>
+    <w:basedOn w:val="Normal"/>
+    <w:qFormat/>
+    <w:pPr>
+      <w:spacing w:before="0" w:after="0" w:line="322" w:lineRule="exact"/>
+      <w:ind w:left="2160" w:right="720" w:hanging="720"/>
+    </w:pPr>
+  </w:style>
+  <w:style w:type="paragraph" w:customStyle="1" w:styleId="XdQuoteList3">
+    <w:name w:val="Xd Quote List 3"/>
+    <w:basedOn w:val="Normal"/>
+    <w:qFormat/>
+    <w:pPr>
+      <w:spacing w:before="0" w:after="0" w:line="322" w:lineRule="exact"/>
+      <w:ind w:left="2880" w:right="720" w:hanging="720"/>
+    </w:pPr>
+  </w:style>
   <w:style w:type="paragraph" w:customStyle="1" w:styleId="SourceCode">
     <w:name w:val="Source Code"/>
     <w:basedOn w:val="Normal"/>

</xml_diff>